<commit_message>
week 6 file modified
</commit_message>
<xml_diff>
--- a/deepskilling_hands_on_exercises/week-6/Git.docx
+++ b/deepskilling_hands_on_exercises/week-6/Git.docx
@@ -18,59 +18,6 @@
       <w:pPr>
         <w:pStyle w:val="ListParagraph"/>
       </w:pPr>
-      <w:r>
-        <w:rPr>
-          <w:noProof/>
-        </w:rPr>
-        <w:drawing>
-          <wp:inline distT="0" distB="0" distL="0" distR="0" wp14:anchorId="5025DE5C" wp14:editId="6FA558D8">
-            <wp:extent cx="5731510" cy="2980690"/>
-            <wp:effectExtent l="0" t="0" r="2540" b="0"/>
-            <wp:docPr id="1959970673" name="Picture 1"/>
-            <wp:cNvGraphicFramePr>
-              <a:graphicFrameLocks xmlns:a="http://schemas.openxmlformats.org/drawingml/2006/main" noChangeAspect="1"/>
-            </wp:cNvGraphicFramePr>
-            <a:graphic xmlns:a="http://schemas.openxmlformats.org/drawingml/2006/main">
-              <a:graphicData uri="http://schemas.openxmlformats.org/drawingml/2006/picture">
-                <pic:pic xmlns:pic="http://schemas.openxmlformats.org/drawingml/2006/picture">
-                  <pic:nvPicPr>
-                    <pic:cNvPr id="0" name="Picture 1"/>
-                    <pic:cNvPicPr>
-                      <a:picLocks noChangeAspect="1" noChangeArrowheads="1"/>
-                    </pic:cNvPicPr>
-                  </pic:nvPicPr>
-                  <pic:blipFill>
-                    <a:blip r:embed="rId5" cstate="print">
-                      <a:extLst>
-                        <a:ext uri="{28A0092B-C50C-407E-A947-70E740481C1C}">
-                          <a14:useLocalDpi xmlns:a14="http://schemas.microsoft.com/office/drawing/2010/main" val="0"/>
-                        </a:ext>
-                      </a:extLst>
-                    </a:blip>
-                    <a:srcRect/>
-                    <a:stretch>
-                      <a:fillRect/>
-                    </a:stretch>
-                  </pic:blipFill>
-                  <pic:spPr bwMode="auto">
-                    <a:xfrm>
-                      <a:off x="0" y="0"/>
-                      <a:ext cx="5731510" cy="2980690"/>
-                    </a:xfrm>
-                    <a:prstGeom prst="rect">
-                      <a:avLst/>
-                    </a:prstGeom>
-                    <a:noFill/>
-                    <a:ln>
-                      <a:noFill/>
-                    </a:ln>
-                  </pic:spPr>
-                </pic:pic>
-              </a:graphicData>
-            </a:graphic>
-          </wp:inline>
-        </w:drawing>
-      </w:r>
     </w:p>
     <w:p>
       <w:pPr>
@@ -96,7 +43,7 @@
                     <pic:cNvPicPr/>
                   </pic:nvPicPr>
                   <pic:blipFill>
-                    <a:blip r:embed="rId6"/>
+                    <a:blip r:embed="rId5"/>
                     <a:stretch>
                       <a:fillRect/>
                     </a:stretch>
@@ -137,7 +84,6 @@
         <w:rPr>
           <w:noProof/>
         </w:rPr>
-        <w:lastRenderedPageBreak/>
         <w:drawing>
           <wp:inline distT="0" distB="0" distL="0" distR="0" wp14:anchorId="08606CBF" wp14:editId="75C62D1F">
             <wp:extent cx="5731510" cy="2943860"/>
@@ -154,7 +100,7 @@
                     <pic:cNvPicPr/>
                   </pic:nvPicPr>
                   <pic:blipFill>
-                    <a:blip r:embed="rId7"/>
+                    <a:blip r:embed="rId6"/>
                     <a:stretch>
                       <a:fillRect/>
                     </a:stretch>
@@ -183,6 +129,7 @@
         <w:rPr>
           <w:noProof/>
         </w:rPr>
+        <w:lastRenderedPageBreak/>
         <w:drawing>
           <wp:inline distT="0" distB="0" distL="0" distR="0" wp14:anchorId="0ABFCC90" wp14:editId="653DAB58">
             <wp:extent cx="5731510" cy="3048000"/>
@@ -199,7 +146,7 @@
                     <pic:cNvPicPr/>
                   </pic:nvPicPr>
                   <pic:blipFill>
-                    <a:blip r:embed="rId8"/>
+                    <a:blip r:embed="rId7"/>
                     <a:stretch>
                       <a:fillRect/>
                     </a:stretch>
@@ -269,7 +216,6 @@
         <w:rPr>
           <w:noProof/>
         </w:rPr>
-        <w:lastRenderedPageBreak/>
         <w:drawing>
           <wp:inline distT="0" distB="0" distL="0" distR="0" wp14:anchorId="736FAD74" wp14:editId="53854962">
             <wp:extent cx="5731510" cy="2873375"/>
@@ -286,7 +232,7 @@
                     <pic:cNvPicPr/>
                   </pic:nvPicPr>
                   <pic:blipFill>
-                    <a:blip r:embed="rId9"/>
+                    <a:blip r:embed="rId8"/>
                     <a:stretch>
                       <a:fillRect/>
                     </a:stretch>
@@ -331,8 +277,9 @@
         <w:rPr>
           <w:noProof/>
         </w:rPr>
+        <w:lastRenderedPageBreak/>
         <w:drawing>
-          <wp:inline distT="0" distB="0" distL="0" distR="0" wp14:anchorId="71412855" wp14:editId="7814721D">
+          <wp:inline distT="0" distB="0" distL="0" distR="0" wp14:anchorId="71412855" wp14:editId="24DB96E8">
             <wp:extent cx="5731510" cy="2132330"/>
             <wp:effectExtent l="0" t="0" r="2540" b="1270"/>
             <wp:docPr id="2058403782" name="Picture 1"/>
@@ -349,7 +296,7 @@
                     </pic:cNvPicPr>
                   </pic:nvPicPr>
                   <pic:blipFill>
-                    <a:blip r:embed="rId10" cstate="print">
+                    <a:blip r:embed="rId9" cstate="print">
                       <a:extLst>
                         <a:ext uri="{28A0092B-C50C-407E-A947-70E740481C1C}">
                           <a14:useLocalDpi xmlns:a14="http://schemas.microsoft.com/office/drawing/2010/main" val="0"/>
@@ -386,6 +333,9 @@
         <w:ind w:left="360"/>
       </w:pPr>
       <w:r>
+        <w:rPr>
+          <w:noProof/>
+        </w:rPr>
         <w:drawing>
           <wp:inline distT="0" distB="0" distL="0" distR="0" wp14:anchorId="2B3CC1A8" wp14:editId="3C6E8C98">
             <wp:extent cx="5731510" cy="3033395"/>
@@ -402,7 +352,7 @@
                     <pic:cNvPicPr/>
                   </pic:nvPicPr>
                   <pic:blipFill>
-                    <a:blip r:embed="rId11"/>
+                    <a:blip r:embed="rId10"/>
                     <a:stretch>
                       <a:fillRect/>
                     </a:stretch>
@@ -428,7 +378,9 @@
         <w:ind w:left="360"/>
       </w:pPr>
       <w:r>
-        <w:lastRenderedPageBreak/>
+        <w:rPr>
+          <w:noProof/>
+        </w:rPr>
         <w:drawing>
           <wp:inline distT="0" distB="0" distL="0" distR="0" wp14:anchorId="4968E96E" wp14:editId="4AD6AD1E">
             <wp:extent cx="5823857" cy="3119048"/>
@@ -445,7 +397,7 @@
                     <pic:cNvPicPr/>
                   </pic:nvPicPr>
                   <pic:blipFill>
-                    <a:blip r:embed="rId12"/>
+                    <a:blip r:embed="rId11"/>
                     <a:stretch>
                       <a:fillRect/>
                     </a:stretch>
@@ -482,6 +434,10 @@
         <w:ind w:left="360"/>
       </w:pPr>
       <w:r>
+        <w:rPr>
+          <w:noProof/>
+        </w:rPr>
+        <w:lastRenderedPageBreak/>
         <w:drawing>
           <wp:inline distT="0" distB="0" distL="0" distR="0" wp14:anchorId="148D6377" wp14:editId="5A949194">
             <wp:extent cx="5731510" cy="2883535"/>
@@ -498,7 +454,7 @@
                     <pic:cNvPicPr/>
                   </pic:nvPicPr>
                   <pic:blipFill>
-                    <a:blip r:embed="rId13"/>
+                    <a:blip r:embed="rId12"/>
                     <a:stretch>
                       <a:fillRect/>
                     </a:stretch>
@@ -524,7 +480,9 @@
         <w:ind w:left="360"/>
       </w:pPr>
       <w:r>
-        <w:lastRenderedPageBreak/>
+        <w:rPr>
+          <w:noProof/>
+        </w:rPr>
         <w:drawing>
           <wp:inline distT="0" distB="0" distL="0" distR="0" wp14:anchorId="4205C29F" wp14:editId="59D23C97">
             <wp:extent cx="5731510" cy="3903980"/>
@@ -541,7 +499,7 @@
                     <pic:cNvPicPr/>
                   </pic:nvPicPr>
                   <pic:blipFill>
-                    <a:blip r:embed="rId14"/>
+                    <a:blip r:embed="rId13"/>
                     <a:stretch>
                       <a:fillRect/>
                     </a:stretch>
@@ -567,6 +525,10 @@
         <w:ind w:left="360"/>
       </w:pPr>
       <w:r>
+        <w:rPr>
+          <w:noProof/>
+        </w:rPr>
+        <w:lastRenderedPageBreak/>
         <w:drawing>
           <wp:inline distT="0" distB="0" distL="0" distR="0" wp14:anchorId="54D955DA" wp14:editId="3CDE17A3">
             <wp:extent cx="5731510" cy="3051175"/>
@@ -583,7 +545,7 @@
                     <pic:cNvPicPr/>
                   </pic:nvPicPr>
                   <pic:blipFill>
-                    <a:blip r:embed="rId15"/>
+                    <a:blip r:embed="rId14"/>
                     <a:stretch>
                       <a:fillRect/>
                     </a:stretch>
@@ -617,7 +579,9 @@
         <w:ind w:left="360"/>
       </w:pPr>
       <w:r>
-        <w:lastRenderedPageBreak/>
+        <w:rPr>
+          <w:noProof/>
+        </w:rPr>
         <w:drawing>
           <wp:inline distT="0" distB="0" distL="0" distR="0" wp14:anchorId="7242E281" wp14:editId="6ACBBC56">
             <wp:extent cx="5731510" cy="2827020"/>
@@ -634,7 +598,7 @@
                     <pic:cNvPicPr/>
                   </pic:nvPicPr>
                   <pic:blipFill>
-                    <a:blip r:embed="rId16"/>
+                    <a:blip r:embed="rId15"/>
                     <a:stretch>
                       <a:fillRect/>
                     </a:stretch>
@@ -660,6 +624,10 @@
         <w:ind w:left="360"/>
       </w:pPr>
       <w:r>
+        <w:rPr>
+          <w:noProof/>
+        </w:rPr>
+        <w:lastRenderedPageBreak/>
         <w:drawing>
           <wp:inline distT="0" distB="0" distL="0" distR="0" wp14:anchorId="162FAA4A" wp14:editId="7628488B">
             <wp:extent cx="5731510" cy="2612390"/>
@@ -676,7 +644,7 @@
                     <pic:cNvPicPr/>
                   </pic:nvPicPr>
                   <pic:blipFill>
-                    <a:blip r:embed="rId17"/>
+                    <a:blip r:embed="rId16"/>
                     <a:stretch>
                       <a:fillRect/>
                     </a:stretch>

</xml_diff>